<commit_message>
complianceReporting: add batch mode with automatic file pair discovery
Added --batch flag to process_h2k_to_nbc.py enabling automated processing
of multiple reference/proposed H2K file pairs. System automatically discovers
matching files by name and generates NBC compliance reports for each pair.

Features:
- Auto-discovery of matching .h2k file pairs in reference/proposed directories
- Progress tracking with success/failure reporting
- Configurable directory paths via command-line arguments
- Backward compatible with existing single-file mode
- Default output to complianceReporting/output/ directory

Usage: python process_h2k_to_nbc.py --batch

🤖 Generated with [Claude Code](https://claude.com/claude-code)

Co-Authored-By: Claude <noreply@anthropic.com>
</commit_message>
<xml_diff>
--- a/complianceReporting/form_template_assumptions.docx
+++ b/complianceReporting/form_template_assumptions.docx
@@ -4659,8 +4659,16 @@
             <w:vAlign w:val="center"/>
           </w:tcPr>
           <w:p>
+            <w:commentRangeStart w:id="1"/>
             <w:r>
               <w:t>Ventilation System</w:t>
+            </w:r>
+            <w:commentRangeEnd w:id="1"/>
+            <w:r>
+              <w:rPr>
+                <w:rStyle w:val="CommentReference"/>
+              </w:rPr>
+              <w:commentReference w:id="1"/>
             </w:r>
           </w:p>
         </w:tc>
@@ -4700,8 +4708,30 @@
             <w:pPr>
               <w:jc w:val="center"/>
             </w:pPr>
-            <w:r>
-              <w:t>{{T5_R31_C2}}</w:t>
+            <w:commentRangeStart w:id="2"/>
+            <w:r>
+              <w:t>{{T5_R31_</w:t>
+            </w:r>
+            <w:commentRangeStart w:id="3"/>
+            <w:r>
+              <w:t>C2</w:t>
+            </w:r>
+            <w:commentRangeEnd w:id="3"/>
+            <w:r>
+              <w:rPr>
+                <w:rStyle w:val="CommentReference"/>
+              </w:rPr>
+              <w:commentReference w:id="3"/>
+            </w:r>
+            <w:r>
+              <w:t>}}</w:t>
+            </w:r>
+            <w:commentRangeEnd w:id="2"/>
+            <w:r>
+              <w:rPr>
+                <w:rStyle w:val="CommentReference"/>
+              </w:rPr>
+              <w:commentReference w:id="2"/>
             </w:r>
           </w:p>
         </w:tc>
@@ -10147,14 +10177,14 @@
             <w:r>
               <w:t xml:space="preserve"> 95%</w:t>
             </w:r>
-            <w:bookmarkStart w:id="1" w:name="_Ref135750228"/>
+            <w:bookmarkStart w:id="4" w:name="_Ref135750228"/>
             <w:r>
               <w:rPr>
                 <w:rStyle w:val="FootnoteReference"/>
               </w:rPr>
               <w:footnoteReference w:id="5"/>
             </w:r>
-            <w:bookmarkEnd w:id="1"/>
+            <w:bookmarkEnd w:id="4"/>
           </w:p>
         </w:tc>
         <w:tc>
@@ -13408,6 +13438,83 @@
     </w:sectPr>
   </w:body>
 </w:document>
+</file>
+
+<file path=word/comments.xml><?xml version="1.0" encoding="utf-8"?>
+<w:comments xmlns:wpc="http://schemas.microsoft.com/office/word/2010/wordprocessingCanvas" xmlns:cx="http://schemas.microsoft.com/office/drawing/2014/chartex" xmlns:cx1="http://schemas.microsoft.com/office/drawing/2015/9/8/chartex" xmlns:cx2="http://schemas.microsoft.com/office/drawing/2015/10/21/chartex" xmlns:cx3="http://schemas.microsoft.com/office/drawing/2016/5/9/chartex" xmlns:cx4="http://schemas.microsoft.com/office/drawing/2016/5/10/chartex" xmlns:cx5="http://schemas.microsoft.com/office/drawing/2016/5/11/chartex" xmlns:cx6="http://schemas.microsoft.com/office/drawing/2016/5/12/chartex" xmlns:cx7="http://schemas.microsoft.com/office/drawing/2016/5/13/chartex" xmlns:cx8="http://schemas.microsoft.com/office/drawing/2016/5/14/chartex" xmlns:mc="http://schemas.openxmlformats.org/markup-compatibility/2006" xmlns:aink="http://schemas.microsoft.com/office/drawing/2016/ink" xmlns:am3d="http://schemas.microsoft.com/office/drawing/2017/model3d" xmlns:o="urn:schemas-microsoft-com:office:office" xmlns:oel="http://schemas.microsoft.com/office/2019/extlst" xmlns:r="http://schemas.openxmlformats.org/officeDocument/2006/relationships" xmlns:m="http://schemas.openxmlformats.org/officeDocument/2006/math" xmlns:v="urn:schemas-microsoft-com:vml" xmlns:wp14="http://schemas.microsoft.com/office/word/2010/wordprocessingDrawing" xmlns:wp="http://schemas.openxmlformats.org/drawingml/2006/wordprocessingDrawing" xmlns:w10="urn:schemas-microsoft-com:office:word" xmlns:w="http://schemas.openxmlformats.org/wordprocessingml/2006/main" xmlns:w14="http://schemas.microsoft.com/office/word/2010/wordml" xmlns:w15="http://schemas.microsoft.com/office/word/2012/wordml" xmlns:w16cex="http://schemas.microsoft.com/office/word/2018/wordml/cex" xmlns:w16cid="http://schemas.microsoft.com/office/word/2016/wordml/cid" xmlns:w16="http://schemas.microsoft.com/office/word/2018/wordml" xmlns:w16du="http://schemas.microsoft.com/office/word/2023/wordml/word16du" xmlns:w16sdtdh="http://schemas.microsoft.com/office/word/2020/wordml/sdtdatahash" xmlns:w16sdtfl="http://schemas.microsoft.com/office/word/2024/wordml/sdtformatlock" xmlns:w16se="http://schemas.microsoft.com/office/word/2015/wordml/symex" xmlns:wpg="http://schemas.microsoft.com/office/word/2010/wordprocessingGroup" xmlns:wpi="http://schemas.microsoft.com/office/word/2010/wordprocessingInk" xmlns:wne="http://schemas.microsoft.com/office/word/2006/wordml" xmlns:wps="http://schemas.microsoft.com/office/word/2010/wordprocessingShape" mc:Ignorable="w14 w15 w16se w16cid w16 w16cex w16sdtdh w16sdtfl w16du wp14">
+  <w:comment w:id="1" w:author="Ryan Kelly" w:date="2025-11-06T10:29:00Z" w:initials="RK">
+    <w:p>
+      <w:pPr>
+        <w:pStyle w:val="CommentText"/>
+      </w:pPr>
+      <w:r>
+        <w:rPr>
+          <w:rStyle w:val="CommentReference"/>
+        </w:rPr>
+        <w:annotationRef/>
+      </w:r>
+      <w:r>
+        <w:t>Not specified in the form, but 9.36.5.11(12) says that when a forced air system is installed and the proposed house uses dedicated low-volume ductwork for ventilation, the ventilation system shall assume the circulation fan operates only when the heating or cooling system is operating. It’s not clear if that means the ventilation system uses the furnace ducts, but I assume so.</w:t>
+      </w:r>
+    </w:p>
+  </w:comment>
+  <w:comment w:id="3" w:author="Ryan Kelly" w:date="2025-11-06T11:38:00Z" w:initials="RK">
+    <w:p>
+      <w:pPr>
+        <w:pStyle w:val="CommentText"/>
+      </w:pPr>
+      <w:r>
+        <w:rPr>
+          <w:rStyle w:val="CommentReference"/>
+        </w:rPr>
+        <w:annotationRef/>
+      </w:r>
+      <w:r>
+        <w:t>I’m extracting only the supply flow rate, but it should be balanced.</w:t>
+      </w:r>
+    </w:p>
+  </w:comment>
+  <w:comment w:id="2" w:author="Ryan Kelly" w:date="2025-11-06T11:13:00Z" w:initials="RK">
+    <w:p>
+      <w:pPr>
+        <w:pStyle w:val="CommentText"/>
+      </w:pPr>
+      <w:r>
+        <w:rPr>
+          <w:rStyle w:val="CommentReference"/>
+        </w:rPr>
+        <w:annotationRef/>
+      </w:r>
+      <w:r>
+        <w:t>This form only has a single flow rate, and looking at 9.36 it does appear that the reference house should use the same flow rate as the proposed. Had to make changes to substitute-h2k.rb to apply the proposed house flow rate to the reference house. Seems to be working, but check in QA.</w:t>
+      </w:r>
+    </w:p>
+  </w:comment>
+</w:comments>
+</file>
+
+<file path=word/commentsExtended.xml><?xml version="1.0" encoding="utf-8"?>
+<w15:commentsEx xmlns:wpc="http://schemas.microsoft.com/office/word/2010/wordprocessingCanvas" xmlns:cx="http://schemas.microsoft.com/office/drawing/2014/chartex" xmlns:cx1="http://schemas.microsoft.com/office/drawing/2015/9/8/chartex" xmlns:cx2="http://schemas.microsoft.com/office/drawing/2015/10/21/chartex" xmlns:cx3="http://schemas.microsoft.com/office/drawing/2016/5/9/chartex" xmlns:cx4="http://schemas.microsoft.com/office/drawing/2016/5/10/chartex" xmlns:cx5="http://schemas.microsoft.com/office/drawing/2016/5/11/chartex" xmlns:cx6="http://schemas.microsoft.com/office/drawing/2016/5/12/chartex" xmlns:cx7="http://schemas.microsoft.com/office/drawing/2016/5/13/chartex" xmlns:cx8="http://schemas.microsoft.com/office/drawing/2016/5/14/chartex" xmlns:mc="http://schemas.openxmlformats.org/markup-compatibility/2006" xmlns:aink="http://schemas.microsoft.com/office/drawing/2016/ink" xmlns:am3d="http://schemas.microsoft.com/office/drawing/2017/model3d" xmlns:o="urn:schemas-microsoft-com:office:office" xmlns:oel="http://schemas.microsoft.com/office/2019/extlst" xmlns:r="http://schemas.openxmlformats.org/officeDocument/2006/relationships" xmlns:m="http://schemas.openxmlformats.org/officeDocument/2006/math" xmlns:v="urn:schemas-microsoft-com:vml" xmlns:wp14="http://schemas.microsoft.com/office/word/2010/wordprocessingDrawing" xmlns:wp="http://schemas.openxmlformats.org/drawingml/2006/wordprocessingDrawing" xmlns:w10="urn:schemas-microsoft-com:office:word" xmlns:w="http://schemas.openxmlformats.org/wordprocessingml/2006/main" xmlns:w14="http://schemas.microsoft.com/office/word/2010/wordml" xmlns:w15="http://schemas.microsoft.com/office/word/2012/wordml" xmlns:w16cex="http://schemas.microsoft.com/office/word/2018/wordml/cex" xmlns:w16cid="http://schemas.microsoft.com/office/word/2016/wordml/cid" xmlns:w16="http://schemas.microsoft.com/office/word/2018/wordml" xmlns:w16du="http://schemas.microsoft.com/office/word/2023/wordml/word16du" xmlns:w16sdtdh="http://schemas.microsoft.com/office/word/2020/wordml/sdtdatahash" xmlns:w16sdtfl="http://schemas.microsoft.com/office/word/2024/wordml/sdtformatlock" xmlns:w16se="http://schemas.microsoft.com/office/word/2015/wordml/symex" xmlns:wpg="http://schemas.microsoft.com/office/word/2010/wordprocessingGroup" xmlns:wpi="http://schemas.microsoft.com/office/word/2010/wordprocessingInk" xmlns:wne="http://schemas.microsoft.com/office/word/2006/wordml" xmlns:wps="http://schemas.microsoft.com/office/word/2010/wordprocessingShape" mc:Ignorable="w14 w15 w16se w16cid w16 w16cex w16sdtdh w16sdtfl w16du wp14">
+  <w15:commentEx w15:paraId="17655BFC" w15:done="0"/>
+  <w15:commentEx w15:paraId="307E8F47" w15:done="0"/>
+  <w15:commentEx w15:paraId="44AE1055" w15:done="0"/>
+</w15:commentsEx>
+</file>
+
+<file path=word/commentsExtensible.xml><?xml version="1.0" encoding="utf-8"?>
+<w16cex:commentsExtensible xmlns:wpc="http://schemas.microsoft.com/office/word/2010/wordprocessingCanvas" xmlns:cx="http://schemas.microsoft.com/office/drawing/2014/chartex" xmlns:cx1="http://schemas.microsoft.com/office/drawing/2015/9/8/chartex" xmlns:cx2="http://schemas.microsoft.com/office/drawing/2015/10/21/chartex" xmlns:cx3="http://schemas.microsoft.com/office/drawing/2016/5/9/chartex" xmlns:cx4="http://schemas.microsoft.com/office/drawing/2016/5/10/chartex" xmlns:cx5="http://schemas.microsoft.com/office/drawing/2016/5/11/chartex" xmlns:cx6="http://schemas.microsoft.com/office/drawing/2016/5/12/chartex" xmlns:cx7="http://schemas.microsoft.com/office/drawing/2016/5/13/chartex" xmlns:cx8="http://schemas.microsoft.com/office/drawing/2016/5/14/chartex" xmlns:cr="http://schemas.microsoft.com/office/comments/2020/reactions" xmlns:mc="http://schemas.openxmlformats.org/markup-compatibility/2006" xmlns:aink="http://schemas.microsoft.com/office/drawing/2016/ink" xmlns:am3d="http://schemas.microsoft.com/office/drawing/2017/model3d" xmlns:o="urn:schemas-microsoft-com:office:office" xmlns:oel="http://schemas.microsoft.com/office/2019/extlst" xmlns:r="http://schemas.openxmlformats.org/officeDocument/2006/relationships" xmlns:m="http://schemas.openxmlformats.org/officeDocument/2006/math" xmlns:v="urn:schemas-microsoft-com:vml" xmlns:wp14="http://schemas.microsoft.com/office/word/2010/wordprocessingDrawing" xmlns:wp="http://schemas.openxmlformats.org/drawingml/2006/wordprocessingDrawing" xmlns:w10="urn:schemas-microsoft-com:office:word" xmlns:w="http://schemas.openxmlformats.org/wordprocessingml/2006/main" xmlns:w14="http://schemas.microsoft.com/office/word/2010/wordml" xmlns:w15="http://schemas.microsoft.com/office/word/2012/wordml" xmlns:w16cex="http://schemas.microsoft.com/office/word/2018/wordml/cex" xmlns:w16cid="http://schemas.microsoft.com/office/word/2016/wordml/cid" xmlns:w16="http://schemas.microsoft.com/office/word/2018/wordml" xmlns:w16du="http://schemas.microsoft.com/office/word/2023/wordml/word16du" xmlns:w16sdtdh="http://schemas.microsoft.com/office/word/2020/wordml/sdtdatahash" xmlns:w16sdtfl="http://schemas.microsoft.com/office/word/2024/wordml/sdtformatlock" xmlns:w16se="http://schemas.microsoft.com/office/word/2015/wordml/symex" xmlns:wpg="http://schemas.microsoft.com/office/word/2010/wordprocessingGroup" xmlns:wpi="http://schemas.microsoft.com/office/word/2010/wordprocessingInk" xmlns:wne="http://schemas.microsoft.com/office/word/2006/wordml" xmlns:wps="http://schemas.microsoft.com/office/word/2010/wordprocessingShape" mc:Ignorable="w14 w15 w16se w16cid w16 w16cex w16sdtdh w16sdtfl cr w16du wp14">
+  <w16cex:commentExtensible w16cex:durableId="0F577F33" w16cex:dateUtc="2025-11-06T14:29:00Z"/>
+  <w16cex:commentExtensible w16cex:durableId="65CF5A9F" w16cex:dateUtc="2025-11-06T15:38:00Z"/>
+  <w16cex:commentExtensible w16cex:durableId="12657F87" w16cex:dateUtc="2025-11-06T15:13:00Z"/>
+</w16cex:commentsExtensible>
+</file>
+
+<file path=word/commentsIds.xml><?xml version="1.0" encoding="utf-8"?>
+<w16cid:commentsIds xmlns:wpc="http://schemas.microsoft.com/office/word/2010/wordprocessingCanvas" xmlns:cx="http://schemas.microsoft.com/office/drawing/2014/chartex" xmlns:cx1="http://schemas.microsoft.com/office/drawing/2015/9/8/chartex" xmlns:cx2="http://schemas.microsoft.com/office/drawing/2015/10/21/chartex" xmlns:cx3="http://schemas.microsoft.com/office/drawing/2016/5/9/chartex" xmlns:cx4="http://schemas.microsoft.com/office/drawing/2016/5/10/chartex" xmlns:cx5="http://schemas.microsoft.com/office/drawing/2016/5/11/chartex" xmlns:cx6="http://schemas.microsoft.com/office/drawing/2016/5/12/chartex" xmlns:cx7="http://schemas.microsoft.com/office/drawing/2016/5/13/chartex" xmlns:cx8="http://schemas.microsoft.com/office/drawing/2016/5/14/chartex" xmlns:mc="http://schemas.openxmlformats.org/markup-compatibility/2006" xmlns:aink="http://schemas.microsoft.com/office/drawing/2016/ink" xmlns:am3d="http://schemas.microsoft.com/office/drawing/2017/model3d" xmlns:o="urn:schemas-microsoft-com:office:office" xmlns:oel="http://schemas.microsoft.com/office/2019/extlst" xmlns:r="http://schemas.openxmlformats.org/officeDocument/2006/relationships" xmlns:m="http://schemas.openxmlformats.org/officeDocument/2006/math" xmlns:v="urn:schemas-microsoft-com:vml" xmlns:wp14="http://schemas.microsoft.com/office/word/2010/wordprocessingDrawing" xmlns:wp="http://schemas.openxmlformats.org/drawingml/2006/wordprocessingDrawing" xmlns:w10="urn:schemas-microsoft-com:office:word" xmlns:w="http://schemas.openxmlformats.org/wordprocessingml/2006/main" xmlns:w14="http://schemas.microsoft.com/office/word/2010/wordml" xmlns:w15="http://schemas.microsoft.com/office/word/2012/wordml" xmlns:w16cex="http://schemas.microsoft.com/office/word/2018/wordml/cex" xmlns:w16cid="http://schemas.microsoft.com/office/word/2016/wordml/cid" xmlns:w16="http://schemas.microsoft.com/office/word/2018/wordml" xmlns:w16du="http://schemas.microsoft.com/office/word/2023/wordml/word16du" xmlns:w16sdtdh="http://schemas.microsoft.com/office/word/2020/wordml/sdtdatahash" xmlns:w16sdtfl="http://schemas.microsoft.com/office/word/2024/wordml/sdtformatlock" xmlns:w16se="http://schemas.microsoft.com/office/word/2015/wordml/symex" xmlns:wpg="http://schemas.microsoft.com/office/word/2010/wordprocessingGroup" xmlns:wpi="http://schemas.microsoft.com/office/word/2010/wordprocessingInk" xmlns:wne="http://schemas.microsoft.com/office/word/2006/wordml" xmlns:wps="http://schemas.microsoft.com/office/word/2010/wordprocessingShape" mc:Ignorable="w14 w15 w16se w16cid w16 w16cex w16sdtdh w16sdtfl w16du wp14">
+  <w16cid:commentId w16cid:paraId="17655BFC" w16cid:durableId="0F577F33"/>
+  <w16cid:commentId w16cid:paraId="307E8F47" w16cid:durableId="65CF5A9F"/>
+  <w16cid:commentId w16cid:paraId="44AE1055" w16cid:durableId="12657F87"/>
+</w16cid:commentsIds>
 </file>
 
 <file path=word/endnotes.xml><?xml version="1.0" encoding="utf-8"?>
@@ -14314,6 +14421,14 @@
     <w:abstractNumId w:val="1"/>
   </w:num>
 </w:numbering>
+</file>
+
+<file path=word/people.xml><?xml version="1.0" encoding="utf-8"?>
+<w15:people xmlns:wpc="http://schemas.microsoft.com/office/word/2010/wordprocessingCanvas" xmlns:cx="http://schemas.microsoft.com/office/drawing/2014/chartex" xmlns:cx1="http://schemas.microsoft.com/office/drawing/2015/9/8/chartex" xmlns:cx2="http://schemas.microsoft.com/office/drawing/2015/10/21/chartex" xmlns:cx3="http://schemas.microsoft.com/office/drawing/2016/5/9/chartex" xmlns:cx4="http://schemas.microsoft.com/office/drawing/2016/5/10/chartex" xmlns:cx5="http://schemas.microsoft.com/office/drawing/2016/5/11/chartex" xmlns:cx6="http://schemas.microsoft.com/office/drawing/2016/5/12/chartex" xmlns:cx7="http://schemas.microsoft.com/office/drawing/2016/5/13/chartex" xmlns:cx8="http://schemas.microsoft.com/office/drawing/2016/5/14/chartex" xmlns:mc="http://schemas.openxmlformats.org/markup-compatibility/2006" xmlns:aink="http://schemas.microsoft.com/office/drawing/2016/ink" xmlns:am3d="http://schemas.microsoft.com/office/drawing/2017/model3d" xmlns:o="urn:schemas-microsoft-com:office:office" xmlns:oel="http://schemas.microsoft.com/office/2019/extlst" xmlns:r="http://schemas.openxmlformats.org/officeDocument/2006/relationships" xmlns:m="http://schemas.openxmlformats.org/officeDocument/2006/math" xmlns:v="urn:schemas-microsoft-com:vml" xmlns:wp14="http://schemas.microsoft.com/office/word/2010/wordprocessingDrawing" xmlns:wp="http://schemas.openxmlformats.org/drawingml/2006/wordprocessingDrawing" xmlns:w10="urn:schemas-microsoft-com:office:word" xmlns:w="http://schemas.openxmlformats.org/wordprocessingml/2006/main" xmlns:w14="http://schemas.microsoft.com/office/word/2010/wordml" xmlns:w15="http://schemas.microsoft.com/office/word/2012/wordml" xmlns:w16cex="http://schemas.microsoft.com/office/word/2018/wordml/cex" xmlns:w16cid="http://schemas.microsoft.com/office/word/2016/wordml/cid" xmlns:w16="http://schemas.microsoft.com/office/word/2018/wordml" xmlns:w16du="http://schemas.microsoft.com/office/word/2023/wordml/word16du" xmlns:w16sdtdh="http://schemas.microsoft.com/office/word/2020/wordml/sdtdatahash" xmlns:w16sdtfl="http://schemas.microsoft.com/office/word/2024/wordml/sdtformatlock" xmlns:w16se="http://schemas.microsoft.com/office/word/2015/wordml/symex" xmlns:wpg="http://schemas.microsoft.com/office/word/2010/wordprocessingGroup" xmlns:wpi="http://schemas.microsoft.com/office/word/2010/wordprocessingInk" xmlns:wne="http://schemas.microsoft.com/office/word/2006/wordml" xmlns:wps="http://schemas.microsoft.com/office/word/2010/wordprocessingShape" mc:Ignorable="w14 w15 w16se w16cid w16 w16cex w16sdtdh w16sdtfl w16du wp14">
+  <w15:person w15:author="Ryan Kelly">
+    <w15:presenceInfo w15:providerId="AD" w15:userId="S::Ryan@baselineenergy.ca::ff464cbe-6de4-4594-a30f-79fa5039b86e"/>
+  </w15:person>
+</w15:people>
 </file>
 
 <file path=word/styles.xml><?xml version="1.0" encoding="utf-8"?>
@@ -15229,7 +15344,6 @@
     <w:basedOn w:val="Normal"/>
     <w:link w:val="CommentTextChar"/>
     <w:uiPriority w:val="99"/>
-    <w:semiHidden/>
     <w:unhideWhenUsed/>
     <w:rsid w:val="004624BA"/>
     <w:pPr>
@@ -15245,7 +15359,6 @@
     <w:basedOn w:val="DefaultParagraphFont"/>
     <w:link w:val="CommentText"/>
     <w:uiPriority w:val="99"/>
-    <w:semiHidden/>
     <w:rsid w:val="004624BA"/>
     <w:rPr>
       <w:sz w:val="20"/>
@@ -15575,10 +15688,6 @@
 </file>
 
 <file path=customXml/item1.xml><?xml version="1.0" encoding="utf-8"?>
-<b:Sources xmlns:b="http://schemas.openxmlformats.org/officeDocument/2006/bibliography" xmlns="http://schemas.openxmlformats.org/officeDocument/2006/bibliography" SelectedStyle="\APASixthEditionOfficeOnline.xsl" StyleName="APA" Version="6"/>
-</file>
-
-<file path=customXml/item2.xml><?xml version="1.0" encoding="utf-8"?>
 <?mso-contentType ?>
 <FormTemplates xmlns="http://schemas.microsoft.com/sharepoint/v3/contenttype/forms">
   <Display>DocumentLibraryForm</Display>
@@ -15587,7 +15696,7 @@
 </FormTemplates>
 </file>
 
-<file path=customXml/item3.xml><?xml version="1.0" encoding="utf-8"?>
+<file path=customXml/item2.xml><?xml version="1.0" encoding="utf-8"?>
 <ct:contentTypeSchema xmlns:ct="http://schemas.microsoft.com/office/2006/metadata/contentType" xmlns:ma="http://schemas.microsoft.com/office/2006/metadata/properties/metaAttributes" ct:_="" ma:_="" ma:contentTypeName="Document" ma:contentTypeID="0x010100BC8627080003174A984BE4C7167C9CAB" ma:contentTypeVersion="11" ma:contentTypeDescription="Create a new document." ma:contentTypeScope="" ma:versionID="ba989ae1afed1151afe658727263eabf">
   <xsd:schema xmlns:xsd="http://www.w3.org/2001/XMLSchema" xmlns:xs="http://www.w3.org/2001/XMLSchema" xmlns:p="http://schemas.microsoft.com/office/2006/metadata/properties" xmlns:ns2="5046f78f-85f1-4872-8afc-3e23afcd1143" xmlns:ns3="6d8d7981-2c7b-4df5-875f-84d256f75a77" targetNamespace="http://schemas.microsoft.com/office/2006/metadata/properties" ma:root="true" ma:fieldsID="8423c74c550c1371655620bfa8d058f5" ns2:_="" ns3:_="">
     <xsd:import namespace="5046f78f-85f1-4872-8afc-3e23afcd1143"/>
@@ -15782,7 +15891,7 @@
 </ct:contentTypeSchema>
 </file>
 
-<file path=customXml/item4.xml><?xml version="1.0" encoding="utf-8"?>
+<file path=customXml/item3.xml><?xml version="1.0" encoding="utf-8"?>
 <p:properties xmlns:p="http://schemas.microsoft.com/office/2006/metadata/properties" xmlns:xsi="http://www.w3.org/2001/XMLSchema-instance" xmlns:pc="http://schemas.microsoft.com/office/infopath/2007/PartnerControls">
   <documentManagement>
     <TaxCatchAll xmlns="6d8d7981-2c7b-4df5-875f-84d256f75a77" xsi:nil="true"/>
@@ -15793,15 +15902,11 @@
 </p:properties>
 </file>
 
-<file path=customXml/itemProps1.xml><?xml version="1.0" encoding="utf-8"?>
-<ds:datastoreItem xmlns:ds="http://schemas.openxmlformats.org/officeDocument/2006/customXml" ds:itemID="{7E0829F9-3C67-4054-B25C-A793A62F6EFF}">
-  <ds:schemaRefs>
-    <ds:schemaRef ds:uri="http://schemas.openxmlformats.org/officeDocument/2006/bibliography"/>
-  </ds:schemaRefs>
-</ds:datastoreItem>
+<file path=customXml/item4.xml><?xml version="1.0" encoding="utf-8"?>
+<b:Sources xmlns:b="http://schemas.openxmlformats.org/officeDocument/2006/bibliography" xmlns="http://schemas.openxmlformats.org/officeDocument/2006/bibliography" SelectedStyle="\APASixthEditionOfficeOnline.xsl" StyleName="APA" Version="6"/>
 </file>
 
-<file path=customXml/itemProps2.xml><?xml version="1.0" encoding="utf-8"?>
+<file path=customXml/itemProps1.xml><?xml version="1.0" encoding="utf-8"?>
 <ds:datastoreItem xmlns:ds="http://schemas.openxmlformats.org/officeDocument/2006/customXml" ds:itemID="{AD2F5A86-7E0F-4EAF-96C2-D40B394D3367}">
   <ds:schemaRefs>
     <ds:schemaRef ds:uri="http://schemas.microsoft.com/sharepoint/v3/contenttype/forms"/>
@@ -15809,7 +15914,7 @@
 </ds:datastoreItem>
 </file>
 
-<file path=customXml/itemProps3.xml><?xml version="1.0" encoding="utf-8"?>
+<file path=customXml/itemProps2.xml><?xml version="1.0" encoding="utf-8"?>
 <ds:datastoreItem xmlns:ds="http://schemas.openxmlformats.org/officeDocument/2006/customXml" ds:itemID="{4F8D9139-9FF2-42B9-8652-96C739F08EC2}">
   <ds:schemaRefs>
     <ds:schemaRef ds:uri="http://schemas.microsoft.com/office/2006/metadata/contentType"/>
@@ -15828,7 +15933,7 @@
 </ds:datastoreItem>
 </file>
 
-<file path=customXml/itemProps4.xml><?xml version="1.0" encoding="utf-8"?>
+<file path=customXml/itemProps3.xml><?xml version="1.0" encoding="utf-8"?>
 <ds:datastoreItem xmlns:ds="http://schemas.openxmlformats.org/officeDocument/2006/customXml" ds:itemID="{89D6AB34-1745-4A93-B120-D767B1671756}">
   <ds:schemaRefs>
     <ds:schemaRef ds:uri="http://schemas.microsoft.com/office/2006/metadata/properties"/>
@@ -15837,4 +15942,12 @@
     <ds:schemaRef ds:uri="5046f78f-85f1-4872-8afc-3e23afcd1143"/>
   </ds:schemaRefs>
 </ds:datastoreItem>
+</file>
+
+<file path=customXml/itemProps4.xml><?xml version="1.0" encoding="utf-8"?>
+<ds:datastoreItem xmlns:ds="http://schemas.openxmlformats.org/officeDocument/2006/customXml" ds:itemID="{7E0829F9-3C67-4054-B25C-A793A62F6EFF}">
+  <ds:schemaRefs>
+    <ds:schemaRef ds:uri="http://schemas.openxmlformats.org/officeDocument/2006/bibliography"/>
+  </ds:schemaRefs>
+</ds:datastoreItem>
 </file>
</xml_diff>